<commit_message>
CU-123tcvwd9v7 CU-123tcvwe2yp CU-123tcvwfnzj rebuild the Week 2 to 4 reports without the front pages
The declaration, dedication and acknowledgement pages are removed, so the
title page is followed directly by the table of contents, as in the Week 5
report. The members are named on the title page and the division of work is
stated at the end of each introduction. No other content changed.
Version 0.4.3.
</commit_message>
<xml_diff>
--- a/docs/weekly-reports/Week 2 Progress Report.docx
+++ b/docs/weekly-reports/Week 2 Progress Report.docx
@@ -64,6 +64,14 @@
         <w:jc w:val="center"/>
       </w:pPr>
       <w:r>
+        <w:t>Jonathan Katongole, Makmot Johnson, Isaac Mwesigwa, Bataringaya Bridget</w:t>
+      </w:r>
+    </w:p>
+    <w:p>
+      <w:pPr>
+        <w:jc w:val="center"/>
+      </w:pPr>
+      <w:r>
         <w:t>School of Computing and Informatics Technology, Makerere University</w:t>
       </w:r>
     </w:p>
@@ -73,86 +81,6 @@
       </w:pPr>
       <w:r>
         <w:t>Reporting period: 11 to 16 September 2026</w:t>
-      </w:r>
-    </w:p>
-    <w:p>
-      <w:pPr>
-        <w:pStyle w:val="Heading1"/>
-      </w:pPr>
-      <w:bookmarkStart w:id="0" w:name="_Toc240510675"/>
-      <w:r>
-        <w:lastRenderedPageBreak/>
-        <w:t>Declaration</w:t>
-      </w:r>
-      <w:bookmarkEnd w:id="0"/>
-    </w:p>
-    <w:p>
-      <w:r>
-        <w:t>The members of Group H (Evening) declare that this report is their own work. It has not been submitted for any other course or award. Work by other authors has been cited where it was used.</w:t>
-      </w:r>
-    </w:p>
-    <w:p>
-      <w:pPr>
-        <w:pStyle w:val="ListBullet"/>
-      </w:pPr>
-      <w:r>
-        <w:t>Jonathan Katongole</w:t>
-      </w:r>
-    </w:p>
-    <w:p>
-      <w:pPr>
-        <w:pStyle w:val="ListBullet"/>
-      </w:pPr>
-      <w:r>
-        <w:t>Makmot Johnson</w:t>
-      </w:r>
-    </w:p>
-    <w:p>
-      <w:pPr>
-        <w:pStyle w:val="ListBullet"/>
-      </w:pPr>
-      <w:r>
-        <w:t>Isaac Mwesigwa</w:t>
-      </w:r>
-    </w:p>
-    <w:p>
-      <w:pPr>
-        <w:pStyle w:val="ListBullet"/>
-      </w:pPr>
-      <w:r>
-        <w:t>Bataringaya Bridget</w:t>
-      </w:r>
-    </w:p>
-    <w:p>
-      <w:pPr>
-        <w:pStyle w:val="Heading1"/>
-      </w:pPr>
-      <w:bookmarkStart w:id="1" w:name="_Toc240510676"/>
-      <w:r>
-        <w:lastRenderedPageBreak/>
-        <w:t>Dedication</w:t>
-      </w:r>
-      <w:bookmarkEnd w:id="1"/>
-    </w:p>
-    <w:p>
-      <w:r>
-        <w:t>This report is dedicated to the procurement officers whose careful checking this project aims to support.</w:t>
-      </w:r>
-    </w:p>
-    <w:p>
-      <w:pPr>
-        <w:pStyle w:val="Heading1"/>
-      </w:pPr>
-      <w:bookmarkStart w:id="2" w:name="_Toc240510677"/>
-      <w:r>
-        <w:lastRenderedPageBreak/>
-        <w:t>Acknowledgement</w:t>
-      </w:r>
-      <w:bookmarkEnd w:id="2"/>
-    </w:p>
-    <w:p>
-      <w:r>
-        <w:t>The group thanks the BSE4104 course lecturer for the weekly structure and the document format that guided this work. Isaac Mwesigwa is thanked for the model selection study that fixed the model and its settings. Makmot Johnson is thanked for the prompt iteration record that first predicted the missing-item failure. Bataringaya Bridget is thanked for writing the ten test cases before the model was integrated. Jonathan Katongole is thanked for integrating the model and running the evaluations.</w:t>
       </w:r>
     </w:p>
     <w:p>
@@ -187,223 +115,7 @@
       <w:r>
         <w:fldChar w:fldCharType="separate"/>
       </w:r>
-      <w:hyperlink w:anchor="_Toc240510675" w:history="1">
-        <w:r>
-          <w:rPr>
-            <w:rStyle w:val="Hyperlink"/>
-            <w:noProof/>
-          </w:rPr>
-          <w:t>Declaration</w:t>
-        </w:r>
-        <w:r>
-          <w:rPr>
-            <w:noProof/>
-            <w:webHidden/>
-          </w:rPr>
-          <w:tab/>
-        </w:r>
-        <w:r>
-          <w:rPr>
-            <w:noProof/>
-            <w:webHidden/>
-          </w:rPr>
-          <w:fldChar w:fldCharType="begin"/>
-        </w:r>
-        <w:r>
-          <w:rPr>
-            <w:noProof/>
-            <w:webHidden/>
-          </w:rPr>
-          <w:instrText xml:space="preserve"> PAGEREF _Toc240510675 \h </w:instrText>
-        </w:r>
-        <w:r>
-          <w:rPr>
-            <w:noProof/>
-            <w:webHidden/>
-          </w:rPr>
-        </w:r>
-        <w:r>
-          <w:rPr>
-            <w:noProof/>
-            <w:webHidden/>
-          </w:rPr>
-          <w:fldChar w:fldCharType="separate"/>
-        </w:r>
-        <w:r>
-          <w:rPr>
-            <w:noProof/>
-            <w:webHidden/>
-          </w:rPr>
-          <w:t>ii</w:t>
-        </w:r>
-        <w:r>
-          <w:rPr>
-            <w:noProof/>
-            <w:webHidden/>
-          </w:rPr>
-          <w:fldChar w:fldCharType="end"/>
-        </w:r>
-      </w:hyperlink>
-    </w:p>
-    <w:p>
-      <w:pPr>
-        <w:pStyle w:val="TOC1"/>
-        <w:tabs>
-          <w:tab w:val="right" w:leader="dot" w:pos="9350"/>
-        </w:tabs>
-        <w:rPr>
-          <w:rFonts w:asciiTheme="minorHAnsi" w:eastAsiaTheme="minorEastAsia" w:hAnsiTheme="minorHAnsi" w:cstheme="minorBidi"/>
-          <w:noProof/>
-          <w:kern w:val="2"/>
-          <w:szCs w:val="24"/>
-          <w14:ligatures w14:val="standardContextual"/>
-        </w:rPr>
-      </w:pPr>
-      <w:hyperlink w:anchor="_Toc240510676" w:history="1">
-        <w:r>
-          <w:rPr>
-            <w:rStyle w:val="Hyperlink"/>
-            <w:noProof/>
-          </w:rPr>
-          <w:t>Dedication</w:t>
-        </w:r>
-        <w:r>
-          <w:rPr>
-            <w:noProof/>
-            <w:webHidden/>
-          </w:rPr>
-          <w:tab/>
-        </w:r>
-        <w:r>
-          <w:rPr>
-            <w:noProof/>
-            <w:webHidden/>
-          </w:rPr>
-          <w:fldChar w:fldCharType="begin"/>
-        </w:r>
-        <w:r>
-          <w:rPr>
-            <w:noProof/>
-            <w:webHidden/>
-          </w:rPr>
-          <w:instrText xml:space="preserve"> PAGEREF _Toc240510676 \h </w:instrText>
-        </w:r>
-        <w:r>
-          <w:rPr>
-            <w:noProof/>
-            <w:webHidden/>
-          </w:rPr>
-        </w:r>
-        <w:r>
-          <w:rPr>
-            <w:noProof/>
-            <w:webHidden/>
-          </w:rPr>
-          <w:fldChar w:fldCharType="separate"/>
-        </w:r>
-        <w:r>
-          <w:rPr>
-            <w:noProof/>
-            <w:webHidden/>
-          </w:rPr>
-          <w:t>iii</w:t>
-        </w:r>
-        <w:r>
-          <w:rPr>
-            <w:noProof/>
-            <w:webHidden/>
-          </w:rPr>
-          <w:fldChar w:fldCharType="end"/>
-        </w:r>
-      </w:hyperlink>
-    </w:p>
-    <w:p>
-      <w:pPr>
-        <w:pStyle w:val="TOC1"/>
-        <w:tabs>
-          <w:tab w:val="right" w:leader="dot" w:pos="9350"/>
-        </w:tabs>
-        <w:rPr>
-          <w:rFonts w:asciiTheme="minorHAnsi" w:eastAsiaTheme="minorEastAsia" w:hAnsiTheme="minorHAnsi" w:cstheme="minorBidi"/>
-          <w:noProof/>
-          <w:kern w:val="2"/>
-          <w:szCs w:val="24"/>
-          <w14:ligatures w14:val="standardContextual"/>
-        </w:rPr>
-      </w:pPr>
-      <w:hyperlink w:anchor="_Toc240510677" w:history="1">
-        <w:r>
-          <w:rPr>
-            <w:rStyle w:val="Hyperlink"/>
-            <w:noProof/>
-          </w:rPr>
-          <w:t>Acknowledgement</w:t>
-        </w:r>
-        <w:r>
-          <w:rPr>
-            <w:noProof/>
-            <w:webHidden/>
-          </w:rPr>
-          <w:tab/>
-        </w:r>
-        <w:r>
-          <w:rPr>
-            <w:noProof/>
-            <w:webHidden/>
-          </w:rPr>
-          <w:fldChar w:fldCharType="begin"/>
-        </w:r>
-        <w:r>
-          <w:rPr>
-            <w:noProof/>
-            <w:webHidden/>
-          </w:rPr>
-          <w:instrText xml:space="preserve"> PAGEREF _Toc240510677 \h </w:instrText>
-        </w:r>
-        <w:r>
-          <w:rPr>
-            <w:noProof/>
-            <w:webHidden/>
-          </w:rPr>
-        </w:r>
-        <w:r>
-          <w:rPr>
-            <w:noProof/>
-            <w:webHidden/>
-          </w:rPr>
-          <w:fldChar w:fldCharType="separate"/>
-        </w:r>
-        <w:r>
-          <w:rPr>
-            <w:noProof/>
-            <w:webHidden/>
-          </w:rPr>
-          <w:t>iv</w:t>
-        </w:r>
-        <w:r>
-          <w:rPr>
-            <w:noProof/>
-            <w:webHidden/>
-          </w:rPr>
-          <w:fldChar w:fldCharType="end"/>
-        </w:r>
-      </w:hyperlink>
-    </w:p>
-    <w:p>
-      <w:pPr>
-        <w:pStyle w:val="TOC1"/>
-        <w:tabs>
-          <w:tab w:val="right" w:leader="dot" w:pos="9350"/>
-        </w:tabs>
-        <w:rPr>
-          <w:rFonts w:asciiTheme="minorHAnsi" w:eastAsiaTheme="minorEastAsia" w:hAnsiTheme="minorHAnsi" w:cstheme="minorBidi"/>
-          <w:noProof/>
-          <w:kern w:val="2"/>
-          <w:szCs w:val="24"/>
-          <w14:ligatures w14:val="standardContextual"/>
-        </w:rPr>
-      </w:pPr>
-      <w:hyperlink w:anchor="_Toc240510678" w:history="1">
+      <w:hyperlink w:anchor="_Toc242223271" w:history="1">
         <w:r>
           <w:rPr>
             <w:rStyle w:val="Hyperlink"/>
@@ -430,7 +142,7 @@
             <w:noProof/>
             <w:webHidden/>
           </w:rPr>
-          <w:instrText xml:space="preserve"> PAGEREF _Toc240510678 \h </w:instrText>
+          <w:instrText xml:space="preserve"> PAGEREF _Toc242223271 \h </w:instrText>
         </w:r>
         <w:r>
           <w:rPr>
@@ -450,7 +162,7 @@
             <w:noProof/>
             <w:webHidden/>
           </w:rPr>
-          <w:t>viii</w:t>
+          <w:t>v</w:t>
         </w:r>
         <w:r>
           <w:rPr>
@@ -475,7 +187,7 @@
           <w14:ligatures w14:val="standardContextual"/>
         </w:rPr>
       </w:pPr>
-      <w:hyperlink w:anchor="_Toc240510679" w:history="1">
+      <w:hyperlink w:anchor="_Toc242223272" w:history="1">
         <w:r>
           <w:rPr>
             <w:rStyle w:val="Hyperlink"/>
@@ -502,7 +214,7 @@
             <w:noProof/>
             <w:webHidden/>
           </w:rPr>
-          <w:instrText xml:space="preserve"> PAGEREF _Toc240510679 \h </w:instrText>
+          <w:instrText xml:space="preserve"> PAGEREF _Toc242223272 \h </w:instrText>
         </w:r>
         <w:r>
           <w:rPr>
@@ -547,7 +259,7 @@
           <w14:ligatures w14:val="standardContextual"/>
         </w:rPr>
       </w:pPr>
-      <w:hyperlink w:anchor="_Toc240510680" w:history="1">
+      <w:hyperlink w:anchor="_Toc242223273" w:history="1">
         <w:r>
           <w:rPr>
             <w:rStyle w:val="Hyperlink"/>
@@ -574,7 +286,7 @@
             <w:noProof/>
             <w:webHidden/>
           </w:rPr>
-          <w:instrText xml:space="preserve"> PAGEREF _Toc240510680 \h </w:instrText>
+          <w:instrText xml:space="preserve"> PAGEREF _Toc242223273 \h </w:instrText>
         </w:r>
         <w:r>
           <w:rPr>
@@ -619,7 +331,7 @@
           <w14:ligatures w14:val="standardContextual"/>
         </w:rPr>
       </w:pPr>
-      <w:hyperlink w:anchor="_Toc240510681" w:history="1">
+      <w:hyperlink w:anchor="_Toc242223274" w:history="1">
         <w:r>
           <w:rPr>
             <w:rStyle w:val="Hyperlink"/>
@@ -646,7 +358,7 @@
             <w:noProof/>
             <w:webHidden/>
           </w:rPr>
-          <w:instrText xml:space="preserve"> PAGEREF _Toc240510681 \h </w:instrText>
+          <w:instrText xml:space="preserve"> PAGEREF _Toc242223274 \h </w:instrText>
         </w:r>
         <w:r>
           <w:rPr>
@@ -691,7 +403,7 @@
           <w14:ligatures w14:val="standardContextual"/>
         </w:rPr>
       </w:pPr>
-      <w:hyperlink w:anchor="_Toc240510682" w:history="1">
+      <w:hyperlink w:anchor="_Toc242223275" w:history="1">
         <w:r>
           <w:rPr>
             <w:rStyle w:val="Hyperlink"/>
@@ -718,7 +430,7 @@
             <w:noProof/>
             <w:webHidden/>
           </w:rPr>
-          <w:instrText xml:space="preserve"> PAGEREF _Toc240510682 \h </w:instrText>
+          <w:instrText xml:space="preserve"> PAGEREF _Toc242223275 \h </w:instrText>
         </w:r>
         <w:r>
           <w:rPr>
@@ -763,7 +475,7 @@
           <w14:ligatures w14:val="standardContextual"/>
         </w:rPr>
       </w:pPr>
-      <w:hyperlink w:anchor="_Toc240510683" w:history="1">
+      <w:hyperlink w:anchor="_Toc242223276" w:history="1">
         <w:r>
           <w:rPr>
             <w:rStyle w:val="Hyperlink"/>
@@ -790,7 +502,7 @@
             <w:noProof/>
             <w:webHidden/>
           </w:rPr>
-          <w:instrText xml:space="preserve"> PAGEREF _Toc240510683 \h </w:instrText>
+          <w:instrText xml:space="preserve"> PAGEREF _Toc242223276 \h </w:instrText>
         </w:r>
         <w:r>
           <w:rPr>
@@ -835,7 +547,7 @@
           <w14:ligatures w14:val="standardContextual"/>
         </w:rPr>
       </w:pPr>
-      <w:hyperlink w:anchor="_Toc240510684" w:history="1">
+      <w:hyperlink w:anchor="_Toc242223277" w:history="1">
         <w:r>
           <w:rPr>
             <w:rStyle w:val="Hyperlink"/>
@@ -862,7 +574,7 @@
             <w:noProof/>
             <w:webHidden/>
           </w:rPr>
-          <w:instrText xml:space="preserve"> PAGEREF _Toc240510684 \h </w:instrText>
+          <w:instrText xml:space="preserve"> PAGEREF _Toc242223277 \h </w:instrText>
         </w:r>
         <w:r>
           <w:rPr>
@@ -907,7 +619,7 @@
           <w14:ligatures w14:val="standardContextual"/>
         </w:rPr>
       </w:pPr>
-      <w:hyperlink w:anchor="_Toc240510685" w:history="1">
+      <w:hyperlink w:anchor="_Toc242223278" w:history="1">
         <w:r>
           <w:rPr>
             <w:rStyle w:val="Hyperlink"/>
@@ -934,7 +646,7 @@
             <w:noProof/>
             <w:webHidden/>
           </w:rPr>
-          <w:instrText xml:space="preserve"> PAGEREF _Toc240510685 \h </w:instrText>
+          <w:instrText xml:space="preserve"> PAGEREF _Toc242223278 \h </w:instrText>
         </w:r>
         <w:r>
           <w:rPr>
@@ -979,7 +691,7 @@
           <w14:ligatures w14:val="standardContextual"/>
         </w:rPr>
       </w:pPr>
-      <w:hyperlink w:anchor="_Toc240510686" w:history="1">
+      <w:hyperlink w:anchor="_Toc242223279" w:history="1">
         <w:r>
           <w:rPr>
             <w:rStyle w:val="Hyperlink"/>
@@ -1006,7 +718,7 @@
             <w:noProof/>
             <w:webHidden/>
           </w:rPr>
-          <w:instrText xml:space="preserve"> PAGEREF _Toc240510686 \h </w:instrText>
+          <w:instrText xml:space="preserve"> PAGEREF _Toc242223279 \h </w:instrText>
         </w:r>
         <w:r>
           <w:rPr>
@@ -1051,7 +763,7 @@
           <w14:ligatures w14:val="standardContextual"/>
         </w:rPr>
       </w:pPr>
-      <w:hyperlink w:anchor="_Toc240510687" w:history="1">
+      <w:hyperlink w:anchor="_Toc242223280" w:history="1">
         <w:r>
           <w:rPr>
             <w:rStyle w:val="Hyperlink"/>
@@ -1078,7 +790,7 @@
             <w:noProof/>
             <w:webHidden/>
           </w:rPr>
-          <w:instrText xml:space="preserve"> PAGEREF _Toc240510687 \h </w:instrText>
+          <w:instrText xml:space="preserve"> PAGEREF _Toc242223280 \h </w:instrText>
         </w:r>
         <w:r>
           <w:rPr>
@@ -1123,7 +835,7 @@
           <w14:ligatures w14:val="standardContextual"/>
         </w:rPr>
       </w:pPr>
-      <w:hyperlink w:anchor="_Toc240510688" w:history="1">
+      <w:hyperlink w:anchor="_Toc242223281" w:history="1">
         <w:r>
           <w:rPr>
             <w:rStyle w:val="Hyperlink"/>
@@ -1150,7 +862,7 @@
             <w:noProof/>
             <w:webHidden/>
           </w:rPr>
-          <w:instrText xml:space="preserve"> PAGEREF _Toc240510688 \h </w:instrText>
+          <w:instrText xml:space="preserve"> PAGEREF _Toc242223281 \h </w:instrText>
         </w:r>
         <w:r>
           <w:rPr>
@@ -1195,7 +907,7 @@
           <w14:ligatures w14:val="standardContextual"/>
         </w:rPr>
       </w:pPr>
-      <w:hyperlink w:anchor="_Toc240510689" w:history="1">
+      <w:hyperlink w:anchor="_Toc242223282" w:history="1">
         <w:r>
           <w:rPr>
             <w:rStyle w:val="Hyperlink"/>
@@ -1222,7 +934,7 @@
             <w:noProof/>
             <w:webHidden/>
           </w:rPr>
-          <w:instrText xml:space="preserve"> PAGEREF _Toc240510689 \h </w:instrText>
+          <w:instrText xml:space="preserve"> PAGEREF _Toc242223282 \h </w:instrText>
         </w:r>
         <w:r>
           <w:rPr>
@@ -1267,7 +979,7 @@
           <w14:ligatures w14:val="standardContextual"/>
         </w:rPr>
       </w:pPr>
-      <w:hyperlink w:anchor="_Toc240510690" w:history="1">
+      <w:hyperlink w:anchor="_Toc242223283" w:history="1">
         <w:r>
           <w:rPr>
             <w:rStyle w:val="Hyperlink"/>
@@ -1294,7 +1006,7 @@
             <w:noProof/>
             <w:webHidden/>
           </w:rPr>
-          <w:instrText xml:space="preserve"> PAGEREF _Toc240510690 \h </w:instrText>
+          <w:instrText xml:space="preserve"> PAGEREF _Toc242223283 \h </w:instrText>
         </w:r>
         <w:r>
           <w:rPr>
@@ -1339,7 +1051,7 @@
           <w14:ligatures w14:val="standardContextual"/>
         </w:rPr>
       </w:pPr>
-      <w:hyperlink w:anchor="_Toc240510691" w:history="1">
+      <w:hyperlink w:anchor="_Toc242223284" w:history="1">
         <w:r>
           <w:rPr>
             <w:rStyle w:val="Hyperlink"/>
@@ -1366,7 +1078,7 @@
             <w:noProof/>
             <w:webHidden/>
           </w:rPr>
-          <w:instrText xml:space="preserve"> PAGEREF _Toc240510691 \h </w:instrText>
+          <w:instrText xml:space="preserve"> PAGEREF _Toc242223284 \h </w:instrText>
         </w:r>
         <w:r>
           <w:rPr>
@@ -1434,7 +1146,7 @@
       <w:r>
         <w:fldChar w:fldCharType="separate"/>
       </w:r>
-      <w:hyperlink w:anchor="_Toc240510692" w:history="1">
+      <w:hyperlink w:anchor="_Toc242223285" w:history="1">
         <w:r>
           <w:rPr>
             <w:rStyle w:val="Hyperlink"/>
@@ -1461,7 +1173,7 @@
             <w:noProof/>
             <w:webHidden/>
           </w:rPr>
-          <w:instrText xml:space="preserve"> PAGEREF _Toc240510692 \h </w:instrText>
+          <w:instrText xml:space="preserve"> PAGEREF _Toc242223285 \h </w:instrText>
         </w:r>
         <w:r>
           <w:rPr>
@@ -1506,7 +1218,7 @@
           <w14:ligatures w14:val="standardContextual"/>
         </w:rPr>
       </w:pPr>
-      <w:hyperlink w:anchor="_Toc240510693" w:history="1">
+      <w:hyperlink w:anchor="_Toc242223286" w:history="1">
         <w:r>
           <w:rPr>
             <w:rStyle w:val="Hyperlink"/>
@@ -1533,7 +1245,7 @@
             <w:noProof/>
             <w:webHidden/>
           </w:rPr>
-          <w:instrText xml:space="preserve"> PAGEREF _Toc240510693 \h </w:instrText>
+          <w:instrText xml:space="preserve"> PAGEREF _Toc242223286 \h </w:instrText>
         </w:r>
         <w:r>
           <w:rPr>
@@ -1578,7 +1290,7 @@
           <w14:ligatures w14:val="standardContextual"/>
         </w:rPr>
       </w:pPr>
-      <w:hyperlink w:anchor="_Toc240510694" w:history="1">
+      <w:hyperlink w:anchor="_Toc242223287" w:history="1">
         <w:r>
           <w:rPr>
             <w:rStyle w:val="Hyperlink"/>
@@ -1605,7 +1317,7 @@
             <w:noProof/>
             <w:webHidden/>
           </w:rPr>
-          <w:instrText xml:space="preserve"> PAGEREF _Toc240510694 \h </w:instrText>
+          <w:instrText xml:space="preserve"> PAGEREF _Toc242223287 \h </w:instrText>
         </w:r>
         <w:r>
           <w:rPr>
@@ -1659,12 +1371,12 @@
       <w:pPr>
         <w:pStyle w:val="Heading1"/>
       </w:pPr>
-      <w:bookmarkStart w:id="3" w:name="_Toc240510678"/>
+      <w:bookmarkStart w:id="0" w:name="_Toc242223271"/>
       <w:r>
         <w:lastRenderedPageBreak/>
         <w:t>Abstract</w:t>
       </w:r>
-      <w:bookmarkEnd w:id="3"/>
+      <w:bookmarkEnd w:id="0"/>
     </w:p>
     <w:p>
       <w:r>
@@ -1722,12 +1434,12 @@
         <w:pStyle w:val="Heading1"/>
         <w:pageBreakBefore w:val="0"/>
       </w:pPr>
-      <w:bookmarkStart w:id="4" w:name="_Toc240510679"/>
+      <w:bookmarkStart w:id="1" w:name="_Toc242223272"/>
       <w:r>
         <w:lastRenderedPageBreak/>
         <w:t>1. Introduction and Objectives</w:t>
       </w:r>
-      <w:bookmarkEnd w:id="4"/>
+      <w:bookmarkEnd w:id="1"/>
     </w:p>
     <w:p>
       <w:r>
@@ -1785,15 +1497,20 @@
       </w:r>
     </w:p>
     <w:p>
+      <w:r>
+        <w:t>The work was shared as follows. Isaac Mwesigwa carried out the model selection study that fixed the model and its settings. Makmot Johnson kept the prompt iteration record that first predicted the missing-item failure. Bataringaya Bridget wrote the ten test cases before the model was integrated. Jonathan Katongole integrated the model and ran the evaluations.</w:t>
+      </w:r>
+    </w:p>
+    <w:p>
       <w:pPr>
         <w:pStyle w:val="Heading1"/>
       </w:pPr>
-      <w:bookmarkStart w:id="5" w:name="_Toc240510680"/>
+      <w:bookmarkStart w:id="2" w:name="_Toc242223273"/>
       <w:r>
         <w:lastRenderedPageBreak/>
         <w:t>2. Background</w:t>
       </w:r>
-      <w:bookmarkEnd w:id="5"/>
+      <w:bookmarkEnd w:id="2"/>
     </w:p>
     <w:p>
       <w:r>
@@ -1824,22 +1541,22 @@
       <w:pPr>
         <w:pStyle w:val="Heading1"/>
       </w:pPr>
-      <w:bookmarkStart w:id="6" w:name="_Toc240510681"/>
+      <w:bookmarkStart w:id="3" w:name="_Toc242223274"/>
       <w:r>
         <w:lastRenderedPageBreak/>
         <w:t>3. Methodology and Procedure</w:t>
       </w:r>
-      <w:bookmarkEnd w:id="6"/>
+      <w:bookmarkEnd w:id="3"/>
     </w:p>
     <w:p>
       <w:pPr>
         <w:pStyle w:val="Heading2"/>
       </w:pPr>
-      <w:bookmarkStart w:id="7" w:name="_Toc240510682"/>
+      <w:bookmarkStart w:id="4" w:name="_Toc242223275"/>
       <w:r>
         <w:t>3.1 Model Selection</w:t>
       </w:r>
-      <w:bookmarkEnd w:id="7"/>
+      <w:bookmarkEnd w:id="4"/>
     </w:p>
     <w:p>
       <w:r>
@@ -1856,7 +1573,7 @@
         <w:pStyle w:val="Caption"/>
         <w:jc w:val="left"/>
       </w:pPr>
-      <w:bookmarkStart w:id="8" w:name="_Toc240510692"/>
+      <w:bookmarkStart w:id="5" w:name="_Toc242223285"/>
       <w:r>
         <w:t xml:space="preserve">Table </w:t>
       </w:r>
@@ -1884,7 +1601,7 @@
       <w:r>
         <w:t>Generation settings used in every run</w:t>
       </w:r>
-      <w:bookmarkEnd w:id="8"/>
+      <w:bookmarkEnd w:id="5"/>
     </w:p>
     <w:tbl>
       <w:tblPr>
@@ -2248,11 +1965,11 @@
       <w:pPr>
         <w:pStyle w:val="Heading2"/>
       </w:pPr>
-      <w:bookmarkStart w:id="9" w:name="_Toc240510683"/>
+      <w:bookmarkStart w:id="6" w:name="_Toc242223276"/>
       <w:r>
         <w:t>3.2 Integration</w:t>
       </w:r>
-      <w:bookmarkEnd w:id="9"/>
+      <w:bookmarkEnd w:id="6"/>
     </w:p>
     <w:p>
       <w:r>
@@ -2273,12 +1990,12 @@
       <w:pPr>
         <w:pStyle w:val="Heading2"/>
       </w:pPr>
-      <w:bookmarkStart w:id="10" w:name="_Toc240510684"/>
+      <w:bookmarkStart w:id="7" w:name="_Toc242223277"/>
       <w:r>
         <w:lastRenderedPageBreak/>
         <w:t>3.3 Prompt Specification and Iterations</w:t>
       </w:r>
-      <w:bookmarkEnd w:id="10"/>
+      <w:bookmarkEnd w:id="7"/>
     </w:p>
     <w:p>
       <w:r>
@@ -2294,11 +2011,11 @@
       <w:pPr>
         <w:pStyle w:val="Heading2"/>
       </w:pPr>
-      <w:bookmarkStart w:id="11" w:name="_Toc240510685"/>
+      <w:bookmarkStart w:id="8" w:name="_Toc242223278"/>
       <w:r>
         <w:t>3.4 Test Data and Procedure</w:t>
       </w:r>
-      <w:bookmarkEnd w:id="11"/>
+      <w:bookmarkEnd w:id="8"/>
     </w:p>
     <w:p>
       <w:r>
@@ -2324,11 +2041,11 @@
       <w:pPr>
         <w:pStyle w:val="Heading2"/>
       </w:pPr>
-      <w:bookmarkStart w:id="12" w:name="_Toc240510686"/>
+      <w:bookmarkStart w:id="9" w:name="_Toc242223279"/>
       <w:r>
         <w:t>3.5 Problems Encountered</w:t>
       </w:r>
-      <w:bookmarkEnd w:id="12"/>
+      <w:bookmarkEnd w:id="9"/>
     </w:p>
     <w:p>
       <w:r>
@@ -2360,12 +2077,12 @@
       <w:pPr>
         <w:pStyle w:val="Heading1"/>
       </w:pPr>
-      <w:bookmarkStart w:id="13" w:name="_Toc240510687"/>
+      <w:bookmarkStart w:id="10" w:name="_Toc242223280"/>
       <w:r>
         <w:lastRenderedPageBreak/>
         <w:t>4. Results</w:t>
       </w:r>
-      <w:bookmarkEnd w:id="13"/>
+      <w:bookmarkEnd w:id="10"/>
     </w:p>
     <w:p>
       <w:r>
@@ -2377,7 +2094,7 @@
         <w:pStyle w:val="Caption"/>
         <w:jc w:val="left"/>
       </w:pPr>
-      <w:bookmarkStart w:id="14" w:name="_Toc240510693"/>
+      <w:bookmarkStart w:id="11" w:name="_Toc242223286"/>
       <w:r>
         <w:t xml:space="preserve">Table </w:t>
       </w:r>
@@ -2405,7 +2122,7 @@
       <w:r>
         <w:t>Built-in evaluation results by prompt version</w:t>
       </w:r>
-      <w:bookmarkEnd w:id="14"/>
+      <w:bookmarkEnd w:id="11"/>
     </w:p>
     <w:tbl>
       <w:tblPr>
@@ -2821,7 +2538,7 @@
         <w:pStyle w:val="Caption"/>
         <w:jc w:val="left"/>
       </w:pPr>
-      <w:bookmarkStart w:id="15" w:name="_Toc240510694"/>
+      <w:bookmarkStart w:id="12" w:name="_Toc242223287"/>
       <w:r>
         <w:t xml:space="preserve">Table </w:t>
       </w:r>
@@ -2849,7 +2566,7 @@
       <w:r>
         <w:t>Team test case results by behaviour tested</w:t>
       </w:r>
-      <w:bookmarkEnd w:id="15"/>
+      <w:bookmarkEnd w:id="12"/>
     </w:p>
     <w:tbl>
       <w:tblPr>
@@ -3223,12 +2940,12 @@
       <w:pPr>
         <w:pStyle w:val="Heading1"/>
       </w:pPr>
-      <w:bookmarkStart w:id="16" w:name="_Toc240510688"/>
+      <w:bookmarkStart w:id="13" w:name="_Toc242223281"/>
       <w:r>
         <w:lastRenderedPageBreak/>
         <w:t>5. Discussion</w:t>
       </w:r>
-      <w:bookmarkEnd w:id="16"/>
+      <w:bookmarkEnd w:id="13"/>
     </w:p>
     <w:p>
       <w:r>
@@ -3259,12 +2976,12 @@
       <w:pPr>
         <w:pStyle w:val="Heading1"/>
       </w:pPr>
-      <w:bookmarkStart w:id="17" w:name="_Toc240510689"/>
+      <w:bookmarkStart w:id="14" w:name="_Toc242223282"/>
       <w:r>
         <w:lastRenderedPageBreak/>
         <w:t>6. Conclusion</w:t>
       </w:r>
-      <w:bookmarkEnd w:id="17"/>
+      <w:bookmarkEnd w:id="14"/>
     </w:p>
     <w:p>
       <w:r>
@@ -3290,12 +3007,12 @@
       <w:pPr>
         <w:pStyle w:val="Heading1"/>
       </w:pPr>
-      <w:bookmarkStart w:id="18" w:name="_Toc240510690"/>
+      <w:bookmarkStart w:id="15" w:name="_Toc242223283"/>
       <w:r>
         <w:lastRenderedPageBreak/>
         <w:t>7. Recommendations</w:t>
       </w:r>
-      <w:bookmarkEnd w:id="18"/>
+      <w:bookmarkEnd w:id="15"/>
     </w:p>
     <w:p>
       <w:pPr>
@@ -3349,12 +3066,12 @@
       <w:pPr>
         <w:pStyle w:val="Heading1"/>
       </w:pPr>
-      <w:bookmarkStart w:id="19" w:name="_Toc240510691"/>
+      <w:bookmarkStart w:id="16" w:name="_Toc242223284"/>
       <w:r>
         <w:lastRenderedPageBreak/>
         <w:t>References</w:t>
       </w:r>
-      <w:bookmarkEnd w:id="19"/>
+      <w:bookmarkEnd w:id="16"/>
     </w:p>
     <w:p>
       <w:r>
@@ -3813,31 +3530,31 @@
       </w:rPr>
     </w:lvl>
   </w:abstractNum>
-  <w:num w:numId="1" w16cid:durableId="646979919">
+  <w:num w:numId="1" w16cid:durableId="1992630963">
     <w:abstractNumId w:val="8"/>
   </w:num>
-  <w:num w:numId="2" w16cid:durableId="1518083883">
+  <w:num w:numId="2" w16cid:durableId="2027101065">
     <w:abstractNumId w:val="6"/>
   </w:num>
-  <w:num w:numId="3" w16cid:durableId="1764375900">
+  <w:num w:numId="3" w16cid:durableId="1524398565">
     <w:abstractNumId w:val="5"/>
   </w:num>
-  <w:num w:numId="4" w16cid:durableId="645627415">
+  <w:num w:numId="4" w16cid:durableId="70274386">
     <w:abstractNumId w:val="4"/>
   </w:num>
-  <w:num w:numId="5" w16cid:durableId="1832023259">
+  <w:num w:numId="5" w16cid:durableId="2052028892">
     <w:abstractNumId w:val="7"/>
   </w:num>
-  <w:num w:numId="6" w16cid:durableId="412434723">
+  <w:num w:numId="6" w16cid:durableId="2142266474">
     <w:abstractNumId w:val="3"/>
   </w:num>
-  <w:num w:numId="7" w16cid:durableId="1416441599">
+  <w:num w:numId="7" w16cid:durableId="2040231990">
     <w:abstractNumId w:val="2"/>
   </w:num>
-  <w:num w:numId="8" w16cid:durableId="1064181068">
+  <w:num w:numId="8" w16cid:durableId="815415493">
     <w:abstractNumId w:val="1"/>
   </w:num>
-  <w:num w:numId="9" w16cid:durableId="362560872">
+  <w:num w:numId="9" w16cid:durableId="512844773">
     <w:abstractNumId w:val="0"/>
   </w:num>
 </w:numbering>
@@ -15242,7 +14959,7 @@
     <w:autoRedefine/>
     <w:uiPriority w:val="39"/>
     <w:unhideWhenUsed/>
-    <w:rsid w:val="000B7253"/>
+    <w:rsid w:val="00D6360C"/>
     <w:pPr>
       <w:spacing w:after="100"/>
     </w:pPr>
@@ -15254,7 +14971,7 @@
     <w:autoRedefine/>
     <w:uiPriority w:val="39"/>
     <w:unhideWhenUsed/>
-    <w:rsid w:val="000B7253"/>
+    <w:rsid w:val="00D6360C"/>
     <w:pPr>
       <w:spacing w:after="100"/>
       <w:ind w:left="240"/>
@@ -15265,7 +14982,7 @@
     <w:basedOn w:val="DefaultParagraphFont"/>
     <w:uiPriority w:val="99"/>
     <w:unhideWhenUsed/>
-    <w:rsid w:val="000B7253"/>
+    <w:rsid w:val="00D6360C"/>
     <w:rPr>
       <w:color w:val="0000FF" w:themeColor="hyperlink"/>
       <w:u w:val="single"/>
@@ -15277,7 +14994,7 @@
     <w:next w:val="Normal"/>
     <w:uiPriority w:val="99"/>
     <w:unhideWhenUsed/>
-    <w:rsid w:val="000B7253"/>
+    <w:rsid w:val="00D6360C"/>
     <w:pPr>
       <w:spacing w:after="0"/>
     </w:pPr>

</xml_diff>